<commit_message>
Rewrite UK report: plain team tone, cite original photo filenames; rebuild docx
</commit_message>
<xml_diff>
--- a/docs/Звіт_доопрацювання_порталу_НААН.docx
+++ b/docs/Звіт_доопрацювання_порталу_НААН.docx
@@ -7,21 +7,12 @@
         <w:pStyle w:val="Title"/>
       </w:pPr>
       <w:r>
-        <w:t>Звіт про доопрацювання вебпорталу Національної академії аграрних наук України</w:t>
+        <w:t>Що змінили й додали на порталі НААН (за наданими матеріалами)</w:t>
       </w:r>
     </w:p>
     <w:p>
       <w:r>
-        <w:rPr>
-          <w:i/>
-          <w:color w:val="606060"/>
-        </w:rPr>
-        <w:t>Підготовлено за результатами опрацювання наданих матеріалів та зауважень. Червень 2026 р.</w:t>
-      </w:r>
-    </w:p>
-    <w:p>
-      <w:r>
-        <w:t>За Вашими матеріалами й зауваженнями до порталу внесено наведені нижче зміни. Усі вони вже опубліковані та доступні на сайті.</w:t>
+        <w:t>Коротко: що саме зробили і звідки це взяли. Джерела — фото, які скинув Микола Володимирович у чат (оригінальні назви файлів — у дужках): друкований довідник зі списком установ і сайтами, презентація до 100-річчя, таблиці зі звіту про діяльність і рукописні зауваження.</w:t>
       </w:r>
     </w:p>
     <w:p>
@@ -29,7 +20,7 @@
         <w:pStyle w:val="Heading1"/>
       </w:pPr>
       <w:r>
-        <w:t>1. Уточнено інформацію про Академію</w:t>
+        <w:t>Виправили факти</w:t>
       </w:r>
     </w:p>
     <w:p>
@@ -40,10 +31,10 @@
         <w:rPr>
           <w:b/>
         </w:rPr>
-        <w:t>Рік заснування</w:t>
+        <w:t>Рік заснування:</w:t>
       </w:r>
       <w:r>
-        <w:t xml:space="preserve"> виправлено на </w:t>
+        <w:t xml:space="preserve"> 1931 → </w:t>
       </w:r>
       <w:r>
         <w:rPr>
@@ -52,41 +43,7 @@
         <w:t>1918</w:t>
       </w:r>
       <w:r>
-        <w:t xml:space="preserve"> (Наказ Міністерства земельних справ від 1 листопада 1918 року). Історію Академії викладено з урахуванням подальших етапів — 1931, 1990 та 2010 років.</w:t>
-      </w:r>
-    </w:p>
-    <w:p>
-      <w:pPr>
-        <w:pStyle w:val="ListBullet"/>
-      </w:pPr>
-      <w:r>
-        <w:t xml:space="preserve">Оновлено </w:t>
-      </w:r>
-      <w:r>
-        <w:rPr>
-          <w:b/>
-        </w:rPr>
-        <w:t>офіційний опис</w:t>
-      </w:r>
-      <w:r>
-        <w:t xml:space="preserve"> Академії — «державна самоврядна наукова організація, провідний центр наукового забезпечення розвитку агропромислового комплексу держави». Формулювання «вища галузева установа» вилучено.</w:t>
-      </w:r>
-    </w:p>
-    <w:p>
-      <w:pPr>
-        <w:pStyle w:val="ListBullet"/>
-      </w:pPr>
-      <w:r>
-        <w:t xml:space="preserve">Виправлено </w:t>
-      </w:r>
-      <w:r>
-        <w:rPr>
-          <w:b/>
-        </w:rPr>
-        <w:t>кількісні показники</w:t>
-      </w:r>
-      <w:r>
-        <w:t>: 176 установ, підприємств та організацій, з них 84 бюджетні наукові установи (замість попереднього «50»).</w:t>
+        <w:t xml:space="preserve"> (наказ Міністерства земельних справ від 1 листопада 1918 р.). Звідки: презентація до 100-річчя (`photo_18`) + рукописна нотатка «рік заснування не 1931, а 1918» (`photo_10`).</w:t>
       </w:r>
     </w:p>
     <w:p>
@@ -97,10 +54,10 @@
         <w:rPr>
           <w:b/>
         </w:rPr>
-        <w:t>Перелік наукових установ</w:t>
+        <w:t>Опис академії:</w:t>
       </w:r>
       <w:r>
-        <w:t xml:space="preserve"> повністю оновлено: подано правильні назви та офіційні вебсайти, згруповані за шістьма науковими відділеннями в належному порядку.</w:t>
+        <w:t xml:space="preserve"> прибрали «вища галузева установа», поставили «державна самоврядна наукова організація…». Звідки: друкований довідник (`photo_19`), презентація (`photo_17`), рукописна нотатка (`photo_10`).</w:t>
       </w:r>
     </w:p>
     <w:p>
@@ -111,10 +68,28 @@
         <w:rPr>
           <w:b/>
         </w:rPr>
-        <w:t>Контакти</w:t>
+        <w:t>Кількість установ:</w:t>
       </w:r>
       <w:r>
-        <w:t xml:space="preserve"> доповнено другим телефоном і факсом. Підрозділ зв'язків подано як «Відділ інформаційного забезпечення та зв'язків з громадськістю».</w:t>
+        <w:t xml:space="preserve"> «50» → </w:t>
+      </w:r>
+      <w:r>
+        <w:rPr>
+          <w:b/>
+        </w:rPr>
+        <w:t>176</w:t>
+      </w:r>
+      <w:r>
+        <w:t xml:space="preserve"> (з них </w:t>
+      </w:r>
+      <w:r>
+        <w:rPr>
+          <w:b/>
+        </w:rPr>
+        <w:t>84</w:t>
+      </w:r>
+      <w:r>
+        <w:t xml:space="preserve"> бюджетні наукові). Звідки: друкований довідник (`photo_19`) + таблиця 1.1 звіту (`photo_1`) + рукописна нотатка «наукових установ не 50» (`photo_10`).</w:t>
       </w:r>
     </w:p>
     <w:p>
@@ -125,10 +100,38 @@
         <w:rPr>
           <w:b/>
         </w:rPr>
-        <w:t>Склад Президії</w:t>
+        <w:t>Перелік установ</w:t>
       </w:r>
       <w:r>
-        <w:t xml:space="preserve"> впорядковано: академіки-секретарі — за відділеннями, члени Президії — за абеткою.</w:t>
+        <w:t xml:space="preserve"> повністю перебудували: правильні назви + офіційні сайти, за 6 відділеннями в правильному порядку (46 установ; додали «Інститут садівництва» з таблиці звіту). Звідки: друковані списки (`photo_19`, `photo_20`, `photo_21`) + таблиця 1.5 (`photo_11`) + рукописна нотатка «назви установ не вірні» (`photo_10`).</w:t>
+      </w:r>
+    </w:p>
+    <w:p>
+      <w:pPr>
+        <w:pStyle w:val="ListBullet"/>
+      </w:pPr>
+      <w:r>
+        <w:rPr>
+          <w:b/>
+        </w:rPr>
+        <w:t>Контакти:</w:t>
+      </w:r>
+      <w:r>
+        <w:t xml:space="preserve"> додали другий телефон і факс; підрозділ назвали «Відділ інформаційного забезпечення та зв'язків з громадськістю» (а не «Прес-служба»). Звідки: телефони/факс — презентація (`photo_17`); назва відділу — рукописна нотатка (`photo_15`).</w:t>
+      </w:r>
+    </w:p>
+    <w:p>
+      <w:pPr>
+        <w:pStyle w:val="ListBullet"/>
+      </w:pPr>
+      <w:r>
+        <w:rPr>
+          <w:b/>
+        </w:rPr>
+        <w:t>Президія:</w:t>
+      </w:r>
+      <w:r>
+        <w:t xml:space="preserve"> впорядкували — академіки-секретарі за відділеннями, члени за абеткою. Звідки: рукописна нотатка «Президія НААН» (`photo_16`).</w:t>
       </w:r>
     </w:p>
     <w:p>
@@ -136,12 +139,12 @@
         <w:pStyle w:val="Heading1"/>
       </w:pPr>
       <w:r>
-        <w:t>2. Емблема</w:t>
+        <w:t>Емблема</w:t>
       </w:r>
     </w:p>
     <w:p>
       <w:r>
-        <w:t>Емблему замінено на якісне зображення офіційної емблеми Академії.</w:t>
+        <w:t>Замінили на якісну версію (стара була тьмяна й нечітка). Звідки: переписка в чаті + офіційне зображення емблеми.</w:t>
       </w:r>
     </w:p>
     <w:p>
@@ -149,7 +152,7 @@
         <w:pStyle w:val="Heading1"/>
       </w:pPr>
       <w:r>
-        <w:t>3. Додано нові розділи (згідно з наданим переліком)</w:t>
+        <w:t>Додали розділи (з рукописного списку «Додати», `photo_15`)</w:t>
       </w:r>
     </w:p>
     <w:p>
@@ -163,7 +166,7 @@
         <w:t>Видавнича діяльність</w:t>
       </w:r>
       <w:r>
-        <w:t xml:space="preserve"> — Державне видавництво «Аграрна наука» та фахові наукові видання.</w:t>
+        <w:t xml:space="preserve"> — ДВ «Аграрна наука» + журнали. Звідки: друкований довідник (`photo_21`).</w:t>
       </w:r>
     </w:p>
     <w:p>
@@ -177,7 +180,7 @@
         <w:t>Інноваційна діяльність</w:t>
       </w:r>
       <w:r>
-        <w:t xml:space="preserve"> — із посиланням на Каталог інноваційних розробок НААН (2019–2025).</w:t>
+        <w:t xml:space="preserve"> — із посиланням на Каталог інноваційних розробок 2019–2025 (посилання відновили з `photo_21`).</w:t>
       </w:r>
     </w:p>
     <w:p>
@@ -191,7 +194,7 @@
         <w:t>Міжнародна діяльність</w:t>
       </w:r>
       <w:r>
-        <w:t xml:space="preserve"> — розділ створено.</w:t>
+        <w:t xml:space="preserve"> — сторінку зробили (тексту в матеріалах не було).</w:t>
       </w:r>
     </w:p>
     <w:p>
@@ -205,7 +208,7 @@
         <w:t>Виставкова діяльність</w:t>
       </w:r>
       <w:r>
-        <w:t xml:space="preserve"> — розділ створено.</w:t>
+        <w:t xml:space="preserve"> — сторінку зробили (тексту в матеріалах не було).</w:t>
       </w:r>
     </w:p>
     <w:p>
@@ -219,7 +222,7 @@
         <w:t>Офіційні документи</w:t>
       </w:r>
       <w:r>
-        <w:t xml:space="preserve"> — Статут; передбачено місце для рішень і постанов Президії та звітів про діяльність.</w:t>
+        <w:t xml:space="preserve"> — Статут + місце під рішення/постанови Президії та звіти. Звідки: рукописна нотатка «Офіційні документи» (`photo_2`).</w:t>
       </w:r>
     </w:p>
     <w:p>
@@ -227,12 +230,15 @@
         <w:pStyle w:val="Heading1"/>
       </w:pPr>
       <w:r>
-        <w:t>Матеріали, які просимо надати від Академії</w:t>
+        <w:t>Чого бракує (треба від академії)</w:t>
       </w:r>
     </w:p>
     <w:p>
+      <w:pPr>
+        <w:pStyle w:val="ListBullet"/>
+      </w:pPr>
       <w:r>
-        <w:t xml:space="preserve">Розділи </w:t>
+        <w:t xml:space="preserve">Тексти для </w:t>
       </w:r>
       <w:r>
         <w:rPr>
@@ -241,7 +247,7 @@
         <w:t>«Міжнародна діяльність»</w:t>
       </w:r>
       <w:r>
-        <w:t xml:space="preserve"> та </w:t>
+        <w:t xml:space="preserve"> і </w:t>
       </w:r>
       <w:r>
         <w:rPr>
@@ -250,21 +256,7 @@
         <w:t>«Виставкова діяльність»</w:t>
       </w:r>
       <w:r>
-        <w:t xml:space="preserve"> створено за Вашим проханням, проте відповідних текстів у наданих матеріалах не було. Просимо надіслати їхній зміст.</w:t>
-      </w:r>
-    </w:p>
-    <w:p>
-      <w:r>
-        <w:t xml:space="preserve">Крім того, для розділу </w:t>
-      </w:r>
-      <w:r>
-        <w:rPr>
-          <w:b/>
-        </w:rPr>
-        <w:t>«Офіційні документи»</w:t>
-      </w:r>
-      <w:r>
-        <w:t xml:space="preserve"> потрібні:</w:t>
+        <w:t xml:space="preserve"> — у списку «Додати» (`photo_15`) вони були, але самого тексту не надали.</w:t>
       </w:r>
     </w:p>
     <w:p>
@@ -272,48 +264,30 @@
         <w:pStyle w:val="ListBullet"/>
       </w:pPr>
       <w:r>
-        <w:t xml:space="preserve">файли </w:t>
+        <w:t xml:space="preserve">Файли </w:t>
       </w:r>
       <w:r>
         <w:rPr>
           <w:b/>
         </w:rPr>
-        <w:t>рішень і постанов Президії</w:t>
+        <w:t>рішень/постанов Президії</w:t>
       </w:r>
       <w:r>
-        <w:t>;</w:t>
-      </w:r>
-    </w:p>
-    <w:p>
-      <w:pPr>
-        <w:pStyle w:val="ListBullet"/>
-      </w:pPr>
-      <w:r>
-        <w:t xml:space="preserve">файли </w:t>
+        <w:t xml:space="preserve"> і </w:t>
       </w:r>
       <w:r>
         <w:rPr>
           <w:b/>
         </w:rPr>
-        <w:t>звітів про діяльність НААН</w:t>
+        <w:t>звітів про діяльність</w:t>
       </w:r>
       <w:r>
-        <w:t>.</w:t>
+        <w:t xml:space="preserve"> (`photo_2`).</w:t>
       </w:r>
     </w:p>
     <w:p>
       <w:r>
-        <w:t>Структуру на сайті вже підготовлено — щойно отримаємо ці матеріали, ми одразу розмістимо їх на порталі.</w:t>
-      </w:r>
-    </w:p>
-    <w:p>
-      <w:r>
-        <w:t>З повагою,</w:t>
-      </w:r>
-    </w:p>
-    <w:p>
-      <w:r>
-        <w:t>команда розробки порталу.</w:t>
+        <w:t>Сторінки під це вже готові — щойно скинете матеріали, одразу поставимо.</w:t>
       </w:r>
     </w:p>
     <w:sectPr>

</xml_diff>